<commit_message>
PR5: rebuild Django web layer without ORM
</commit_message>
<xml_diff>
--- a/reports/Отчет_ПЗ5.docx
+++ b/reports/Отчет_ПЗ5.docx
@@ -4,144 +4,138 @@
   <w:body>
     <w:p>
       <w:pPr>
-        <w:jc w:val="center"/>
+        <w:pStyle w:val="Title"/>
       </w:pPr>
       <w:r>
-        <w:rPr>
-          <w:b/>
-          <w:sz w:val="28"/>
-        </w:rPr>
-        <w:t>ОТЧЁТ ПО ПРАКТИЧЕСКОМУ ЗАНЯТИЮ № 5</w:t>
+        <w:t>Отчёт по практической работе №5 — основы Django</w:t>
       </w:r>
     </w:p>
     <w:p>
       <w:r>
-        <w:t>Дисциплина: Технологии разработки приложений на базе фреймворков.</w:t>
+        <w:t>ФИО: ______________________________    Группа: __________    Дата: __________</w:t>
+      </w:r>
+    </w:p>
+    <w:p>
+      <w:pPr>
+        <w:pStyle w:val="Heading1"/>
+      </w:pPr>
+      <w:r>
+        <w:t>Цель работы</w:t>
       </w:r>
     </w:p>
     <w:p>
       <w:r>
-        <w:t>Выполнил(а): [ВПИШИТЕ ФИО].</w:t>
+        <w:t>Создать Django-проект и приложение для отображения системы учёта посетителей, сохранив объектную модель ПР3 и JSON-хранилище.</w:t>
+      </w:r>
+    </w:p>
+    <w:p>
+      <w:pPr>
+        <w:pStyle w:val="Heading1"/>
+      </w:pPr>
+      <w:r>
+        <w:t>Выполненная работа</w:t>
       </w:r>
     </w:p>
     <w:p>
       <w:r>
-        <w:t>Группа: [ВПИШИТЕ ГРУППУ].</w:t>
+        <w:t>Созданы visitor_project и webapp. В settings.py настроены приложение, шаблоны и static-файлы; в корневом urls.py подключён webapp через include(). Реализованы view-функции списков и карточек посетителей, сотрудников, пропусков и посещений.</w:t>
+      </w:r>
+    </w:p>
+    <w:p>
+      <w:pPr>
+        <w:pStyle w:val="Heading1"/>
+      </w:pPr>
+      <w:r>
+        <w:t>Архитектура данных</w:t>
       </w:r>
     </w:p>
     <w:p>
       <w:r>
-        <w:t>Преподаватель: [ВПИШИТЕ ФИО].</w:t>
+        <w:t>View загружают data/*.json через storage.py и передают объекты Visitor, Employee, AccessPass и Visit в шаблоны. Django ORM, SQLite, Forms и авторизация на этой работе не используются.</w:t>
+      </w:r>
+    </w:p>
+    <w:p>
+      <w:pPr>
+        <w:pStyle w:val="Heading1"/>
+      </w:pPr>
+      <w:r>
+        <w:t>Маршрутизация и 404</w:t>
       </w:r>
     </w:p>
     <w:p>
       <w:r>
-        <w:t>Год: 2026.</w:t>
+        <w:t>Добавлены именованные маршруты и динамические конвертеры &lt;int:..._id&gt;. Для отсутствующей записи используется Http404; /visitors/999999/ демонстрирует обработку ошибки.</w:t>
+      </w:r>
+    </w:p>
+    <w:p>
+      <w:pPr>
+        <w:pStyle w:val="Heading1"/>
+      </w:pPr>
+      <w:r>
+        <w:t>Демонстрация</w:t>
       </w:r>
     </w:p>
     <w:p>
       <w:r>
-        <w:t>Проект: «Система учёта посетителей организации».</w:t>
+        <w:t>Запустить python manage.py runserver и открыть /, /visitors/, /employees/, /passes/, /visits/. Показать settings.py, visitor_project/urls.py, webapp/urls.py и webapp/views.py.</w:t>
       </w:r>
     </w:p>
     <w:p>
       <w:pPr>
-        <w:jc w:val="center"/>
+        <w:pStyle w:val="Heading1"/>
       </w:pPr>
       <w:r>
-        <w:rPr>
-          <w:b/>
-        </w:rPr>
-        <w:t>Тема: Реализация backend и frontend логики веб-приложения</w:t>
+        <w:t>Команды проверки</w:t>
       </w:r>
     </w:p>
     <w:p>
       <w:pPr>
-        <w:jc w:val="center"/>
+        <w:pStyle w:val="IntenseQuote"/>
       </w:pPr>
       <w:r>
-        <w:rPr>
-          <w:b/>
-        </w:rPr>
-        <w:t>Цель и требования</w:t>
+        <w:t>python manage.py check</w:t>
       </w:r>
     </w:p>
     <w:p>
       <w:pPr>
-        <w:spacing w:line="360" w:lineRule="auto"/>
-        <w:ind w:firstLine="709"/>
-        <w:jc w:val="both"/>
+        <w:pStyle w:val="IntenseQuote"/>
       </w:pPr>
       <w:r>
-        <w:t>Изучить разработку серверной и клиентской частей, интеграцию через API, безопасность, тестирование и подготовку развёртывания.</w:t>
+        <w:t>python manage.py test webapp</w:t>
       </w:r>
     </w:p>
     <w:p>
       <w:pPr>
-        <w:jc w:val="center"/>
+        <w:pStyle w:val="IntenseQuote"/>
       </w:pPr>
       <w:r>
-        <w:rPr>
-          <w:b/>
-        </w:rPr>
-        <w:t>Выполненная работа</w:t>
+        <w:t>python -m pytest -v</w:t>
       </w:r>
     </w:p>
     <w:p>
       <w:pPr>
-        <w:spacing w:line="360" w:lineRule="auto"/>
-        <w:ind w:firstLine="709"/>
-        <w:jc w:val="both"/>
+        <w:pStyle w:val="IntenseQuote"/>
       </w:pPr>
       <w:r>
-        <w:t>Создан backend на Django и SQLite. Добавлены модели посетителя, сотрудника, пропуска и посещения, HTML-интерфейс с формами, JSON API /api/visitors/ и /api/visits/, бизнес-проверки допуска и запрета дублирующих посещений.</w:t>
+        <w:t>python -m flake8 .</w:t>
       </w:r>
     </w:p>
     <w:p>
       <w:pPr>
-        <w:jc w:val="center"/>
+        <w:pStyle w:val="Heading1"/>
       </w:pPr>
       <w:r>
-        <w:rPr>
-          <w:b/>
-        </w:rPr>
-        <w:t>Безопасность и проверка</w:t>
-      </w:r>
-    </w:p>
-    <w:p>
-      <w:pPr>
-        <w:spacing w:line="360" w:lineRule="auto"/>
-        <w:ind w:firstLine="709"/>
-        <w:jc w:val="both"/>
-      </w:pPr>
-      <w:r>
-        <w:t>Добавлены авторизация Django, login_required, CSRF-токены, валидация Django Forms и ограничения базы данных. Запуск проверки: python manage.py check, python -m pytest -v, python -m flake8 .</w:t>
-      </w:r>
-    </w:p>
-    <w:p>
-      <w:pPr>
-        <w:jc w:val="center"/>
-      </w:pPr>
-      <w:r>
-        <w:rPr>
-          <w:b/>
-        </w:rPr>
         <w:t>Вывод</w:t>
       </w:r>
     </w:p>
     <w:p>
-      <w:pPr>
-        <w:spacing w:line="360" w:lineRule="auto"/>
-        <w:ind w:firstLine="709"/>
-        <w:jc w:val="both"/>
-      </w:pPr>
       <w:r>
-        <w:t>Подготовлена связанная backend/frontend версия системы учёта посетителей.</w:t>
+        <w:t>Работа выполнена. Результат можно продемонстрировать через локальный Django-сервер и файлы проекта.</w:t>
       </w:r>
     </w:p>
     <w:sectPr>
       <w:pgSz w:w="12240" w:h="15840"/>
-      <w:pgMar w:top="1134" w:right="850" w:bottom="1134" w:left="1701" w:header="720" w:footer="720" w:gutter="0"/>
+      <w:pgMar w:top="1440" w:right="1800" w:bottom="1440" w:left="1800" w:header="720" w:footer="720" w:gutter="0"/>
       <w:cols w:space="720"/>
       <w:docGrid w:linePitch="360"/>
     </w:sectPr>
@@ -512,6 +506,10 @@
     <w:name w:val="Normal"/>
     <w:qFormat/>
     <w:rsid w:val="00FC693F"/>
+    <w:rPr>
+      <w:rFonts w:ascii="Arial" w:hAnsi="Arial"/>
+      <w:sz w:val="22"/>
+    </w:rPr>
   </w:style>
   <w:style w:type="paragraph" w:styleId="Header">
     <w:name w:val="header"/>
@@ -527,6 +525,10 @@
       </w:tabs>
       <w:spacing w:after="0" w:line="240" w:lineRule="auto"/>
     </w:pPr>
+    <w:rPr>
+      <w:rFonts w:ascii="Arial" w:hAnsi="Arial"/>
+      <w:sz w:val="22"/>
+    </w:rPr>
   </w:style>
   <w:style w:type="character" w:customStyle="1" w:styleId="HeaderChar">
     <w:name w:val="Header Char"/>
@@ -549,6 +551,10 @@
       </w:tabs>
       <w:spacing w:after="0" w:line="240" w:lineRule="auto"/>
     </w:pPr>
+    <w:rPr>
+      <w:rFonts w:ascii="Arial" w:hAnsi="Arial"/>
+      <w:sz w:val="22"/>
+    </w:rPr>
   </w:style>
   <w:style w:type="character" w:customStyle="1" w:styleId="FooterChar">
     <w:name w:val="Footer Char"/>
@@ -572,11 +578,11 @@
       <w:outlineLvl w:val="0"/>
     </w:pPr>
     <w:rPr>
-      <w:rFonts w:asciiTheme="majorHAnsi" w:eastAsiaTheme="majorEastAsia" w:hAnsiTheme="majorHAnsi" w:cstheme="majorBidi"/>
+      <w:rFonts w:asciiTheme="majorHAnsi" w:eastAsiaTheme="majorEastAsia" w:hAnsiTheme="majorHAnsi" w:cstheme="majorBidi" w:ascii="Arial" w:hAnsi="Arial"/>
       <w:b/>
       <w:bCs/>
       <w:color w:val="365F91" w:themeColor="accent1" w:themeShade="BF"/>
-      <w:sz w:val="28"/>
+      <w:sz w:val="22"/>
       <w:szCs w:val="28"/>
     </w:rPr>
   </w:style>
@@ -596,11 +602,11 @@
       <w:outlineLvl w:val="1"/>
     </w:pPr>
     <w:rPr>
-      <w:rFonts w:asciiTheme="majorHAnsi" w:eastAsiaTheme="majorEastAsia" w:hAnsiTheme="majorHAnsi" w:cstheme="majorBidi"/>
+      <w:rFonts w:asciiTheme="majorHAnsi" w:eastAsiaTheme="majorEastAsia" w:hAnsiTheme="majorHAnsi" w:cstheme="majorBidi" w:ascii="Arial" w:hAnsi="Arial"/>
       <w:b/>
       <w:bCs/>
       <w:color w:val="4F81BD" w:themeColor="accent1"/>
-      <w:sz w:val="26"/>
+      <w:sz w:val="22"/>
       <w:szCs w:val="26"/>
     </w:rPr>
   </w:style>
@@ -620,10 +626,11 @@
       <w:outlineLvl w:val="2"/>
     </w:pPr>
     <w:rPr>
-      <w:rFonts w:asciiTheme="majorHAnsi" w:eastAsiaTheme="majorEastAsia" w:hAnsiTheme="majorHAnsi" w:cstheme="majorBidi"/>
+      <w:rFonts w:asciiTheme="majorHAnsi" w:eastAsiaTheme="majorEastAsia" w:hAnsiTheme="majorHAnsi" w:cstheme="majorBidi" w:ascii="Arial" w:hAnsi="Arial"/>
       <w:b/>
       <w:bCs/>
       <w:color w:val="4F81BD" w:themeColor="accent1"/>
+      <w:sz w:val="22"/>
     </w:rPr>
   </w:style>
   <w:style w:type="paragraph" w:styleId="Heading4">
@@ -643,12 +650,13 @@
       <w:outlineLvl w:val="3"/>
     </w:pPr>
     <w:rPr>
-      <w:rFonts w:asciiTheme="majorHAnsi" w:eastAsiaTheme="majorEastAsia" w:hAnsiTheme="majorHAnsi" w:cstheme="majorBidi"/>
+      <w:rFonts w:asciiTheme="majorHAnsi" w:eastAsiaTheme="majorEastAsia" w:hAnsiTheme="majorHAnsi" w:cstheme="majorBidi" w:ascii="Arial" w:hAnsi="Arial"/>
       <w:b/>
       <w:bCs/>
       <w:i/>
       <w:iCs/>
       <w:color w:val="4F81BD" w:themeColor="accent1"/>
+      <w:sz w:val="22"/>
     </w:rPr>
   </w:style>
   <w:style w:type="paragraph" w:styleId="Heading5">
@@ -668,8 +676,9 @@
       <w:outlineLvl w:val="4"/>
     </w:pPr>
     <w:rPr>
-      <w:rFonts w:asciiTheme="majorHAnsi" w:eastAsiaTheme="majorEastAsia" w:hAnsiTheme="majorHAnsi" w:cstheme="majorBidi"/>
+      <w:rFonts w:asciiTheme="majorHAnsi" w:eastAsiaTheme="majorEastAsia" w:hAnsiTheme="majorHAnsi" w:cstheme="majorBidi" w:ascii="Arial" w:hAnsi="Arial"/>
       <w:color w:val="243F60" w:themeColor="accent1" w:themeShade="7F"/>
+      <w:sz w:val="22"/>
     </w:rPr>
   </w:style>
   <w:style w:type="paragraph" w:styleId="Heading6">
@@ -689,10 +698,11 @@
       <w:outlineLvl w:val="5"/>
     </w:pPr>
     <w:rPr>
-      <w:rFonts w:asciiTheme="majorHAnsi" w:eastAsiaTheme="majorEastAsia" w:hAnsiTheme="majorHAnsi" w:cstheme="majorBidi"/>
+      <w:rFonts w:asciiTheme="majorHAnsi" w:eastAsiaTheme="majorEastAsia" w:hAnsiTheme="majorHAnsi" w:cstheme="majorBidi" w:ascii="Arial" w:hAnsi="Arial"/>
       <w:i/>
       <w:iCs/>
       <w:color w:val="243F60" w:themeColor="accent1" w:themeShade="7F"/>
+      <w:sz w:val="22"/>
     </w:rPr>
   </w:style>
   <w:style w:type="paragraph" w:styleId="Heading7">
@@ -712,10 +722,11 @@
       <w:outlineLvl w:val="6"/>
     </w:pPr>
     <w:rPr>
-      <w:rFonts w:asciiTheme="majorHAnsi" w:eastAsiaTheme="majorEastAsia" w:hAnsiTheme="majorHAnsi" w:cstheme="majorBidi"/>
+      <w:rFonts w:asciiTheme="majorHAnsi" w:eastAsiaTheme="majorEastAsia" w:hAnsiTheme="majorHAnsi" w:cstheme="majorBidi" w:ascii="Arial" w:hAnsi="Arial"/>
       <w:i/>
       <w:iCs/>
       <w:color w:val="404040" w:themeColor="text1" w:themeTint="BF"/>
+      <w:sz w:val="22"/>
     </w:rPr>
   </w:style>
   <w:style w:type="paragraph" w:styleId="Heading8">
@@ -735,9 +746,9 @@
       <w:outlineLvl w:val="7"/>
     </w:pPr>
     <w:rPr>
-      <w:rFonts w:asciiTheme="majorHAnsi" w:eastAsiaTheme="majorEastAsia" w:hAnsiTheme="majorHAnsi" w:cstheme="majorBidi"/>
+      <w:rFonts w:asciiTheme="majorHAnsi" w:eastAsiaTheme="majorEastAsia" w:hAnsiTheme="majorHAnsi" w:cstheme="majorBidi" w:ascii="Arial" w:hAnsi="Arial"/>
       <w:color w:val="4F81BD" w:themeColor="accent1"/>
-      <w:sz w:val="20"/>
+      <w:sz w:val="22"/>
       <w:szCs w:val="20"/>
     </w:rPr>
   </w:style>
@@ -758,11 +769,11 @@
       <w:outlineLvl w:val="8"/>
     </w:pPr>
     <w:rPr>
-      <w:rFonts w:asciiTheme="majorHAnsi" w:eastAsiaTheme="majorEastAsia" w:hAnsiTheme="majorHAnsi" w:cstheme="majorBidi"/>
+      <w:rFonts w:asciiTheme="majorHAnsi" w:eastAsiaTheme="majorEastAsia" w:hAnsiTheme="majorHAnsi" w:cstheme="majorBidi" w:ascii="Arial" w:hAnsi="Arial"/>
       <w:i/>
       <w:iCs/>
       <w:color w:val="404040" w:themeColor="text1" w:themeTint="BF"/>
-      <w:sz w:val="20"/>
+      <w:sz w:val="22"/>
       <w:szCs w:val="20"/>
     </w:rPr>
   </w:style>
@@ -801,6 +812,10 @@
     <w:pPr>
       <w:spacing w:after="0" w:line="240" w:lineRule="auto"/>
     </w:pPr>
+    <w:rPr>
+      <w:rFonts w:ascii="Arial" w:hAnsi="Arial"/>
+      <w:sz w:val="22"/>
+    </w:rPr>
   </w:style>
   <w:style w:type="character" w:customStyle="1" w:styleId="Heading1Char">
     <w:name w:val="Heading 1 Char"/>
@@ -861,11 +876,11 @@
       <w:contextualSpacing/>
     </w:pPr>
     <w:rPr>
-      <w:rFonts w:asciiTheme="majorHAnsi" w:eastAsiaTheme="majorEastAsia" w:hAnsiTheme="majorHAnsi" w:cstheme="majorBidi"/>
+      <w:rFonts w:asciiTheme="majorHAnsi" w:eastAsiaTheme="majorEastAsia" w:hAnsiTheme="majorHAnsi" w:cstheme="majorBidi" w:ascii="Arial" w:hAnsi="Arial"/>
       <w:color w:val="17365D" w:themeColor="text2" w:themeShade="BF"/>
       <w:spacing w:val="5"/>
       <w:kern w:val="28"/>
-      <w:sz w:val="52"/>
+      <w:sz w:val="22"/>
       <w:szCs w:val="52"/>
     </w:rPr>
   </w:style>
@@ -898,12 +913,12 @@
       </w:numPr>
     </w:pPr>
     <w:rPr>
-      <w:rFonts w:asciiTheme="majorHAnsi" w:eastAsiaTheme="majorEastAsia" w:hAnsiTheme="majorHAnsi" w:cstheme="majorBidi"/>
+      <w:rFonts w:asciiTheme="majorHAnsi" w:eastAsiaTheme="majorEastAsia" w:hAnsiTheme="majorHAnsi" w:cstheme="majorBidi" w:ascii="Arial" w:hAnsi="Arial"/>
       <w:i/>
       <w:iCs/>
       <w:color w:val="4F81BD" w:themeColor="accent1"/>
       <w:spacing w:val="15"/>
-      <w:sz w:val="24"/>
+      <w:sz w:val="22"/>
       <w:szCs w:val="24"/>
     </w:rPr>
   </w:style>
@@ -933,6 +948,10 @@
       <w:ind w:left="720"/>
       <w:contextualSpacing/>
     </w:pPr>
+    <w:rPr>
+      <w:rFonts w:ascii="Arial" w:hAnsi="Arial"/>
+      <w:sz w:val="22"/>
+    </w:rPr>
   </w:style>
   <w:style w:type="paragraph" w:styleId="BodyText">
     <w:name w:val="Body Text"/>
@@ -944,6 +963,10 @@
     <w:pPr>
       <w:spacing w:after="120"/>
     </w:pPr>
+    <w:rPr>
+      <w:rFonts w:ascii="Arial" w:hAnsi="Arial"/>
+      <w:sz w:val="22"/>
+    </w:rPr>
   </w:style>
   <w:style w:type="character" w:customStyle="1" w:styleId="BodyTextChar">
     <w:name w:val="Body Text Char"/>
@@ -962,6 +985,10 @@
     <w:pPr>
       <w:spacing w:after="120" w:line="480" w:lineRule="auto"/>
     </w:pPr>
+    <w:rPr>
+      <w:rFonts w:ascii="Arial" w:hAnsi="Arial"/>
+      <w:sz w:val="22"/>
+    </w:rPr>
   </w:style>
   <w:style w:type="character" w:customStyle="1" w:styleId="BodyText2Char">
     <w:name w:val="Body Text 2 Char"/>
@@ -981,7 +1008,8 @@
       <w:spacing w:after="120"/>
     </w:pPr>
     <w:rPr>
-      <w:sz w:val="16"/>
+      <w:rFonts w:ascii="Arial" w:hAnsi="Arial"/>
+      <w:sz w:val="22"/>
       <w:szCs w:val="16"/>
     </w:rPr>
   </w:style>
@@ -1006,6 +1034,10 @@
       <w:ind w:left="360" w:hanging="360"/>
       <w:contextualSpacing/>
     </w:pPr>
+    <w:rPr>
+      <w:rFonts w:ascii="Arial" w:hAnsi="Arial"/>
+      <w:sz w:val="22"/>
+    </w:rPr>
   </w:style>
   <w:style w:type="paragraph" w:styleId="List2">
     <w:name w:val="List 2"/>
@@ -1017,6 +1049,10 @@
       <w:ind w:left="720" w:hanging="360"/>
       <w:contextualSpacing/>
     </w:pPr>
+    <w:rPr>
+      <w:rFonts w:ascii="Arial" w:hAnsi="Arial"/>
+      <w:sz w:val="22"/>
+    </w:rPr>
   </w:style>
   <w:style w:type="paragraph" w:styleId="List3">
     <w:name w:val="List 3"/>
@@ -1028,6 +1064,10 @@
       <w:ind w:left="1080" w:hanging="360"/>
       <w:contextualSpacing/>
     </w:pPr>
+    <w:rPr>
+      <w:rFonts w:ascii="Arial" w:hAnsi="Arial"/>
+      <w:sz w:val="22"/>
+    </w:rPr>
   </w:style>
   <w:style w:type="paragraph" w:styleId="ListBullet">
     <w:name w:val="List Bullet"/>
@@ -1041,6 +1081,10 @@
       </w:numPr>
       <w:contextualSpacing/>
     </w:pPr>
+    <w:rPr>
+      <w:rFonts w:ascii="Arial" w:hAnsi="Arial"/>
+      <w:sz w:val="22"/>
+    </w:rPr>
   </w:style>
   <w:style w:type="paragraph" w:styleId="ListBullet2">
     <w:name w:val="List Bullet 2"/>
@@ -1054,6 +1098,10 @@
       </w:numPr>
       <w:contextualSpacing/>
     </w:pPr>
+    <w:rPr>
+      <w:rFonts w:ascii="Arial" w:hAnsi="Arial"/>
+      <w:sz w:val="22"/>
+    </w:rPr>
   </w:style>
   <w:style w:type="paragraph" w:styleId="ListBullet3">
     <w:name w:val="List Bullet 3"/>
@@ -1067,6 +1115,10 @@
       </w:numPr>
       <w:contextualSpacing/>
     </w:pPr>
+    <w:rPr>
+      <w:rFonts w:ascii="Arial" w:hAnsi="Arial"/>
+      <w:sz w:val="22"/>
+    </w:rPr>
   </w:style>
   <w:style w:type="paragraph" w:styleId="ListNumber">
     <w:name w:val="List Number"/>
@@ -1080,6 +1132,10 @@
       </w:numPr>
       <w:contextualSpacing/>
     </w:pPr>
+    <w:rPr>
+      <w:rFonts w:ascii="Arial" w:hAnsi="Arial"/>
+      <w:sz w:val="22"/>
+    </w:rPr>
   </w:style>
   <w:style w:type="paragraph" w:styleId="ListNumber2">
     <w:name w:val="List Number 2"/>
@@ -1093,6 +1149,10 @@
       </w:numPr>
       <w:contextualSpacing/>
     </w:pPr>
+    <w:rPr>
+      <w:rFonts w:ascii="Arial" w:hAnsi="Arial"/>
+      <w:sz w:val="22"/>
+    </w:rPr>
   </w:style>
   <w:style w:type="paragraph" w:styleId="ListNumber3">
     <w:name w:val="List Number 3"/>
@@ -1106,6 +1166,10 @@
       </w:numPr>
       <w:contextualSpacing/>
     </w:pPr>
+    <w:rPr>
+      <w:rFonts w:ascii="Arial" w:hAnsi="Arial"/>
+      <w:sz w:val="22"/>
+    </w:rPr>
   </w:style>
   <w:style w:type="paragraph" w:styleId="ListContinue">
     <w:name w:val="List Continue"/>
@@ -1118,6 +1182,10 @@
       <w:ind w:left="360"/>
       <w:contextualSpacing/>
     </w:pPr>
+    <w:rPr>
+      <w:rFonts w:ascii="Arial" w:hAnsi="Arial"/>
+      <w:sz w:val="22"/>
+    </w:rPr>
   </w:style>
   <w:style w:type="paragraph" w:styleId="ListContinue2">
     <w:name w:val="List Continue 2"/>
@@ -1130,6 +1198,10 @@
       <w:ind w:left="720"/>
       <w:contextualSpacing/>
     </w:pPr>
+    <w:rPr>
+      <w:rFonts w:ascii="Arial" w:hAnsi="Arial"/>
+      <w:sz w:val="22"/>
+    </w:rPr>
   </w:style>
   <w:style w:type="paragraph" w:styleId="ListContinue3">
     <w:name w:val="List Continue 3"/>
@@ -1142,6 +1214,10 @@
       <w:ind w:left="1080"/>
       <w:contextualSpacing/>
     </w:pPr>
+    <w:rPr>
+      <w:rFonts w:ascii="Arial" w:hAnsi="Arial"/>
+      <w:sz w:val="22"/>
+    </w:rPr>
   </w:style>
   <w:style w:type="paragraph" w:styleId="MacroText">
     <w:name w:val="macro"/>
@@ -1161,8 +1237,8 @@
       </w:tabs>
     </w:pPr>
     <w:rPr>
-      <w:rFonts w:ascii="Courier" w:hAnsi="Courier"/>
-      <w:sz w:val="20"/>
+      <w:rFonts w:ascii="Arial" w:hAnsi="Arial"/>
+      <w:sz w:val="22"/>
       <w:szCs w:val="20"/>
     </w:rPr>
   </w:style>
@@ -1187,9 +1263,11 @@
     <w:qFormat/>
     <w:rsid w:val="00FC693F"/>
     <w:rPr>
+      <w:rFonts w:ascii="Arial" w:hAnsi="Arial"/>
       <w:i/>
       <w:iCs/>
       <w:color w:val="000000" w:themeColor="text1"/>
+      <w:sz w:val="22"/>
     </w:rPr>
   </w:style>
   <w:style w:type="character" w:customStyle="1" w:styleId="QuoteChar">
@@ -1303,10 +1381,11 @@
       <w:spacing w:line="240" w:lineRule="auto"/>
     </w:pPr>
     <w:rPr>
+      <w:rFonts w:ascii="Arial" w:hAnsi="Arial"/>
       <w:b/>
       <w:bCs/>
       <w:color w:val="4F81BD" w:themeColor="accent1"/>
-      <w:sz w:val="18"/>
+      <w:sz w:val="22"/>
       <w:szCs w:val="18"/>
     </w:rPr>
   </w:style>
@@ -1348,11 +1427,13 @@
       <w:ind w:left="936" w:right="936"/>
     </w:pPr>
     <w:rPr>
+      <w:rFonts w:ascii="Arial" w:hAnsi="Arial"/>
       <w:b/>
       <w:bCs/>
       <w:i/>
       <w:iCs/>
       <w:color w:val="4F81BD" w:themeColor="accent1"/>
+      <w:sz w:val="22"/>
     </w:rPr>
   </w:style>
   <w:style w:type="character" w:customStyle="1" w:styleId="IntenseQuoteChar">
@@ -1447,6 +1528,10 @@
     <w:pPr>
       <w:outlineLvl w:val="9"/>
     </w:pPr>
+    <w:rPr>
+      <w:rFonts w:ascii="Arial" w:hAnsi="Arial"/>
+      <w:sz w:val="22"/>
+    </w:rPr>
   </w:style>
   <w:style w:type="table" w:styleId="TableGrid">
     <w:name w:val="Table Grid"/>

</xml_diff>